<commit_message>
release: v1.1.0 — tab-based multi-file editing, singleton IPC, tab persistence
</commit_message>
<xml_diff>
--- a/docs/GHS-Markdown-Editor-User-Guide.docx
+++ b/docs/GHS-Markdown-Editor-User-Guide.docx
@@ -62,7 +62,7 @@
           <w:sz w:val="22"/>
           <w:szCs w:val="22"/>
         </w:rPr>
-        <w:t xml:space="preserve">Version 1.0.0</w:t>
+        <w:t xml:space="preserve">Version 1.1.0</w:t>
       </w:r>
     </w:p>
     <w:p>
@@ -654,7 +654,7 @@
           <w:highlight w:val="yellow"/>
           <w:highlightCs w:val="yellow"/>
         </w:rPr>
-        <w:t xml:space="preserve">GHSMarkdownEditor-Setup-1.0.0.exe</w:t>
+        <w:t xml:space="preserve">GHSMarkdownEditor-Setup-1.1.0.exe</w:t>
       </w:r>
       <w:r>
         <w:rPr>
@@ -816,7 +816,7 @@
           <w:highlight w:val="yellow"/>
           <w:highlightCs w:val="yellow"/>
         </w:rPr>
-        <w:t xml:space="preserve">GHSMarkdownEditor-1.0.0.dmg</w:t>
+        <w:t xml:space="preserve">GHSMarkdownEditor-1.1.0.dmg</w:t>
       </w:r>
       <w:r>
         <w:rPr>
@@ -999,6 +999,23 @@
           <w:szCs w:val="22"/>
         </w:rPr>
         <w:t xml:space="preserve">GHS Markdown Editor auto-saves a draft every 60 seconds. If the app closes unexpectedly, it will offer to restore your unsaved work the next time you open the file.</w:t>
+      </w:r>
+    </w:p>
+    <w:p>
+      <w:pPr>
+        <w:pBdr>
+          <w:left w:val="single" w:color="4A9EFF" w:sz="4" w:space="8"/>
+        </w:pBdr>
+        <w:spacing w:after="80" w:before="80"/>
+        <w:ind w:left="360"/>
+      </w:pPr>
+      <w:r>
+        <w:rPr>
+          <w:rFonts w:ascii="Arial" w:cs="Arial" w:eastAsia="Arial" w:hAnsi="Arial"/>
+          <w:sz w:val="22"/>
+          <w:szCs w:val="22"/>
+        </w:rPr>
+        <w:t xml:space="preserve">💡 Tip: Your open tabs are restored automatically on relaunch. If you had three files open when you closed the app, all three reopen exactly where you left them — same active tab, same scroll position.</w:t>
       </w:r>
     </w:p>
     <w:p>
@@ -1151,7 +1168,7 @@
           <w:sz w:val="22"/>
           <w:szCs w:val="22"/>
         </w:rPr>
-        <w:t xml:space="preserve">The top bar shows the current filename and gives you quick access to view modes (Edit, Split, Preview), the Export panel, Print, and Focus Mode. The formatting toolbar toggle (≡) and Detach Preview button (⧉) are also here.</w:t>
+        <w:t xml:space="preserve">The top bar contains the tab strip in the center (see Multi-File Tabs below), flanked by the app name label on the left and quick-access controls on the right: view modes (Edit, Split, Preview), Export, Print, Focus Mode, the formatting toolbar toggle (≡), and Detach Preview (⧉).</w:t>
       </w:r>
     </w:p>
     <w:p>
@@ -6146,7 +6163,7 @@
           <w:sz w:val="22"/>
           <w:szCs w:val="22"/>
         </w:rPr>
-        <w:t xml:space="preserve"> reveals the Custom Colors section with 10 color pickers:</w:t>
+        <w:t xml:space="preserve"> reveals the Custom Colors section with two groups of color pickers — 10 UI chrome colors and 10 Markdown syntax colors:</w:t>
       </w:r>
     </w:p>
     <w:p>
@@ -6531,6 +6548,220 @@
           <w:szCs w:val="22"/>
         </w:rPr>
         <w:t xml:space="preserve"> to return all colors to the GHS Dark baseline.</w:t>
+      </w:r>
+    </w:p>
+    <w:p>
+      <w:pPr>
+        <w:pStyle w:val="Heading3"/>
+        <w:spacing w:after="80" w:before="200"/>
+      </w:pPr>
+      <w:r>
+        <w:rPr>
+          <w:rFonts w:ascii="Arial" w:cs="Arial" w:eastAsia="Arial" w:hAnsi="Arial"/>
+          <w:b/>
+          <w:bCs/>
+          <w:color w:val="2E6EA6"/>
+          <w:sz w:val="22"/>
+          <w:szCs w:val="22"/>
+        </w:rPr>
+        <w:t xml:space="preserve">Markdown Syntax Colors</w:t>
+      </w:r>
+    </w:p>
+    <w:p>
+      <w:pPr>
+        <w:spacing w:after="80" w:before="80"/>
+      </w:pPr>
+      <w:r>
+        <w:rPr>
+          <w:rFonts w:ascii="Arial" w:cs="Arial" w:eastAsia="Arial" w:hAnsi="Arial"/>
+          <w:sz w:val="22"/>
+          <w:szCs w:val="22"/>
+        </w:rPr>
+        <w:t xml:space="preserve">Below the UI chrome colors, a second group controls how Markdown elements are colored in the editor and preview:</w:t>
+      </w:r>
+    </w:p>
+    <w:p>
+      <w:pPr>
+        <w:numPr>
+          <w:ilvl w:val="0"/>
+          <w:numId w:val="1"/>
+        </w:numPr>
+        <w:spacing w:after="60" w:before="60"/>
+      </w:pPr>
+      <w:r>
+        <w:rPr>
+          <w:rFonts w:ascii="Arial" w:cs="Arial" w:eastAsia="Arial" w:hAnsi="Arial"/>
+          <w:b/>
+          <w:bCs/>
+          <w:sz w:val="22"/>
+          <w:szCs w:val="22"/>
+        </w:rPr>
+        <w:t xml:space="preserve">H1 through H6</w:t>
+      </w:r>
+      <w:r>
+        <w:rPr>
+          <w:rFonts w:ascii="Arial" w:cs="Arial" w:eastAsia="Arial" w:hAnsi="Arial"/>
+          <w:sz w:val="22"/>
+          <w:szCs w:val="22"/>
+        </w:rPr>
+        <w:t xml:space="preserve"> — individual accent color for each heading level in the editor and preview</w:t>
+      </w:r>
+    </w:p>
+    <w:p>
+      <w:pPr>
+        <w:numPr>
+          <w:ilvl w:val="0"/>
+          <w:numId w:val="1"/>
+        </w:numPr>
+        <w:spacing w:after="60" w:before="60"/>
+      </w:pPr>
+      <w:r>
+        <w:rPr>
+          <w:rFonts w:ascii="Arial" w:cs="Arial" w:eastAsia="Arial" w:hAnsi="Arial"/>
+          <w:b/>
+          <w:bCs/>
+          <w:sz w:val="22"/>
+          <w:szCs w:val="22"/>
+        </w:rPr>
+        <w:t xml:space="preserve">Bold Text</w:t>
+      </w:r>
+      <w:r>
+        <w:rPr>
+          <w:rFonts w:ascii="Arial" w:cs="Arial" w:eastAsia="Arial" w:hAnsi="Arial"/>
+          <w:sz w:val="22"/>
+          <w:szCs w:val="22"/>
+        </w:rPr>
+        <w:t xml:space="preserve"> — color applied to **bold** syntax in the editor</w:t>
+      </w:r>
+    </w:p>
+    <w:p>
+      <w:pPr>
+        <w:numPr>
+          <w:ilvl w:val="0"/>
+          <w:numId w:val="1"/>
+        </w:numPr>
+        <w:spacing w:after="60" w:before="60"/>
+      </w:pPr>
+      <w:r>
+        <w:rPr>
+          <w:rFonts w:ascii="Arial" w:cs="Arial" w:eastAsia="Arial" w:hAnsi="Arial"/>
+          <w:b/>
+          <w:bCs/>
+          <w:sz w:val="22"/>
+          <w:szCs w:val="22"/>
+        </w:rPr>
+        <w:t xml:space="preserve">Italic Text</w:t>
+      </w:r>
+      <w:r>
+        <w:rPr>
+          <w:rFonts w:ascii="Arial" w:cs="Arial" w:eastAsia="Arial" w:hAnsi="Arial"/>
+          <w:sz w:val="22"/>
+          <w:szCs w:val="22"/>
+        </w:rPr>
+        <w:t xml:space="preserve"> — color applied to *italic* syntax in the editor</w:t>
+      </w:r>
+    </w:p>
+    <w:p>
+      <w:pPr>
+        <w:numPr>
+          <w:ilvl w:val="0"/>
+          <w:numId w:val="1"/>
+        </w:numPr>
+        <w:spacing w:after="60" w:before="60"/>
+      </w:pPr>
+      <w:r>
+        <w:rPr>
+          <w:rFonts w:ascii="Arial" w:cs="Arial" w:eastAsia="Arial" w:hAnsi="Arial"/>
+          <w:b/>
+          <w:bCs/>
+          <w:sz w:val="22"/>
+          <w:szCs w:val="22"/>
+        </w:rPr>
+        <w:t xml:space="preserve">Code Color</w:t>
+      </w:r>
+      <w:r>
+        <w:rPr>
+          <w:rFonts w:ascii="Arial" w:cs="Arial" w:eastAsia="Arial" w:hAnsi="Arial"/>
+          <w:sz w:val="22"/>
+          <w:szCs w:val="22"/>
+        </w:rPr>
+        <w:t xml:space="preserve"> — color for inline code and code block syntax in the editor and preview</w:t>
+      </w:r>
+    </w:p>
+    <w:p>
+      <w:pPr>
+        <w:numPr>
+          <w:ilvl w:val="0"/>
+          <w:numId w:val="1"/>
+        </w:numPr>
+        <w:spacing w:after="60" w:before="60"/>
+      </w:pPr>
+      <w:r>
+        <w:rPr>
+          <w:rFonts w:ascii="Arial" w:cs="Arial" w:eastAsia="Arial" w:hAnsi="Arial"/>
+          <w:b/>
+          <w:bCs/>
+          <w:sz w:val="22"/>
+          <w:szCs w:val="22"/>
+        </w:rPr>
+        <w:t xml:space="preserve">Blockquote</w:t>
+      </w:r>
+      <w:r>
+        <w:rPr>
+          <w:rFonts w:ascii="Arial" w:cs="Arial" w:eastAsia="Arial" w:hAnsi="Arial"/>
+          <w:sz w:val="22"/>
+          <w:szCs w:val="22"/>
+        </w:rPr>
+        <w:t xml:space="preserve"> — color for &gt; blockquote text in the preview</w:t>
+      </w:r>
+    </w:p>
+    <w:p>
+      <w:pPr>
+        <w:spacing w:after="80" w:before="80"/>
+      </w:pPr>
+      <w:r>
+        <w:rPr>
+          <w:rFonts w:ascii="Arial" w:cs="Arial" w:eastAsia="Arial" w:hAnsi="Arial"/>
+          <w:sz w:val="22"/>
+          <w:szCs w:val="22"/>
+        </w:rPr>
+        <w:t xml:space="preserve">Use </w:t>
+      </w:r>
+      <w:r>
+        <w:rPr>
+          <w:rFonts w:ascii="Arial" w:cs="Arial" w:eastAsia="Arial" w:hAnsi="Arial"/>
+          <w:b/>
+          <w:bCs/>
+          <w:sz w:val="22"/>
+          <w:szCs w:val="22"/>
+        </w:rPr>
+        <w:t xml:space="preserve">Reset to Dark</w:t>
+      </w:r>
+      <w:r>
+        <w:rPr>
+          <w:rFonts w:ascii="Arial" w:cs="Arial" w:eastAsia="Arial" w:hAnsi="Arial"/>
+          <w:sz w:val="22"/>
+          <w:szCs w:val="22"/>
+        </w:rPr>
+        <w:t xml:space="preserve"> or </w:t>
+      </w:r>
+      <w:r>
+        <w:rPr>
+          <w:rFonts w:ascii="Arial" w:cs="Arial" w:eastAsia="Arial" w:hAnsi="Arial"/>
+          <w:b/>
+          <w:bCs/>
+          <w:sz w:val="22"/>
+          <w:szCs w:val="22"/>
+        </w:rPr>
+        <w:t xml:space="preserve">Reset to Light</w:t>
+      </w:r>
+      <w:r>
+        <w:rPr>
+          <w:rFonts w:ascii="Arial" w:cs="Arial" w:eastAsia="Arial" w:hAnsi="Arial"/>
+          <w:sz w:val="22"/>
+          <w:szCs w:val="22"/>
+        </w:rPr>
+        <w:t xml:space="preserve"> to restore all 20 color pickers to either the GHS Dark or GHS Light baseline.</w:t>
       </w:r>
     </w:p>
     <w:p>
@@ -7765,6 +7996,189 @@
                 <w:szCs w:val="20"/>
               </w:rPr>
               <w:t xml:space="preserve">Ctrl+Shift+P</w:t>
+            </w:r>
+          </w:p>
+        </w:tc>
+      </w:tr>
+      <w:tr>
+        <w:tc>
+          <w:tcPr>
+            <w:tcW w:type="dxa" w:w="5000"/>
+            <w:tcBorders>
+              <w:top w:val="single" w:color="CCCCCC" w:sz="1"/>
+              <w:left w:val="single" w:color="CCCCCC" w:sz="1"/>
+              <w:bottom w:val="single" w:color="CCCCCC" w:sz="1"/>
+              <w:right w:val="single" w:color="CCCCCC" w:sz="1"/>
+            </w:tcBorders>
+            <w:shd w:fill="FFFFFF" w:val="clear"/>
+            <w:tcMar>
+              <w:top w:type="dxa" w:w="80"/>
+              <w:left w:type="dxa" w:w="160"/>
+              <w:bottom w:type="dxa" w:w="80"/>
+              <w:right w:type="dxa" w:w="160"/>
+            </w:tcMar>
+          </w:tcPr>
+          <w:p>
+            <w:r>
+              <w:rPr>
+                <w:rFonts w:ascii="Arial" w:cs="Arial" w:eastAsia="Arial" w:hAnsi="Arial"/>
+                <w:sz w:val="20"/>
+                <w:szCs w:val="20"/>
+              </w:rPr>
+              <w:t xml:space="preserve">New Tab</w:t>
+            </w:r>
+          </w:p>
+        </w:tc>
+        <w:tc>
+          <w:tcPr>
+            <w:tcW w:type="dxa" w:w="4360"/>
+            <w:tcBorders>
+              <w:top w:val="single" w:color="CCCCCC" w:sz="1"/>
+              <w:left w:val="single" w:color="CCCCCC" w:sz="1"/>
+              <w:bottom w:val="single" w:color="CCCCCC" w:sz="1"/>
+              <w:right w:val="single" w:color="CCCCCC" w:sz="1"/>
+            </w:tcBorders>
+            <w:shd w:fill="F0F4FF" w:val="clear"/>
+            <w:tcMar>
+              <w:top w:type="dxa" w:w="80"/>
+              <w:left w:type="dxa" w:w="160"/>
+              <w:bottom w:type="dxa" w:w="80"/>
+              <w:right w:type="dxa" w:w="160"/>
+            </w:tcMar>
+          </w:tcPr>
+          <w:p>
+            <w:r>
+              <w:rPr>
+                <w:rFonts w:ascii="Courier New" w:cs="Courier New" w:eastAsia="Courier New" w:hAnsi="Courier New"/>
+                <w:b/>
+                <w:bCs/>
+                <w:color w:val="1A3A5C"/>
+                <w:sz w:val="20"/>
+                <w:szCs w:val="20"/>
+              </w:rPr>
+              <w:t xml:space="preserve">Ctrl+T</w:t>
+            </w:r>
+          </w:p>
+        </w:tc>
+      </w:tr>
+      <w:tr>
+        <w:tc>
+          <w:tcPr>
+            <w:tcW w:type="dxa" w:w="5000"/>
+            <w:tcBorders>
+              <w:top w:val="single" w:color="CCCCCC" w:sz="1"/>
+              <w:left w:val="single" w:color="CCCCCC" w:sz="1"/>
+              <w:bottom w:val="single" w:color="CCCCCC" w:sz="1"/>
+              <w:right w:val="single" w:color="CCCCCC" w:sz="1"/>
+            </w:tcBorders>
+            <w:shd w:fill="FFFFFF" w:val="clear"/>
+            <w:tcMar>
+              <w:top w:type="dxa" w:w="80"/>
+              <w:left w:type="dxa" w:w="160"/>
+              <w:bottom w:type="dxa" w:w="80"/>
+              <w:right w:type="dxa" w:w="160"/>
+            </w:tcMar>
+          </w:tcPr>
+          <w:p>
+            <w:r>
+              <w:rPr>
+                <w:rFonts w:ascii="Arial" w:cs="Arial" w:eastAsia="Arial" w:hAnsi="Arial"/>
+                <w:sz w:val="20"/>
+                <w:szCs w:val="20"/>
+              </w:rPr>
+              <w:t xml:space="preserve">Close Tab</w:t>
+            </w:r>
+          </w:p>
+        </w:tc>
+        <w:tc>
+          <w:tcPr>
+            <w:tcW w:type="dxa" w:w="4360"/>
+            <w:tcBorders>
+              <w:top w:val="single" w:color="CCCCCC" w:sz="1"/>
+              <w:left w:val="single" w:color="CCCCCC" w:sz="1"/>
+              <w:bottom w:val="single" w:color="CCCCCC" w:sz="1"/>
+              <w:right w:val="single" w:color="CCCCCC" w:sz="1"/>
+            </w:tcBorders>
+            <w:shd w:fill="F0F4FF" w:val="clear"/>
+            <w:tcMar>
+              <w:top w:type="dxa" w:w="80"/>
+              <w:left w:type="dxa" w:w="160"/>
+              <w:bottom w:type="dxa" w:w="80"/>
+              <w:right w:type="dxa" w:w="160"/>
+            </w:tcMar>
+          </w:tcPr>
+          <w:p>
+            <w:r>
+              <w:rPr>
+                <w:rFonts w:ascii="Courier New" w:cs="Courier New" w:eastAsia="Courier New" w:hAnsi="Courier New"/>
+                <w:b/>
+                <w:bCs/>
+                <w:color w:val="1A3A5C"/>
+                <w:sz w:val="20"/>
+                <w:szCs w:val="20"/>
+              </w:rPr>
+              <w:t xml:space="preserve">Ctrl+W</w:t>
+            </w:r>
+          </w:p>
+        </w:tc>
+      </w:tr>
+      <w:tr>
+        <w:tc>
+          <w:tcPr>
+            <w:tcW w:type="dxa" w:w="5000"/>
+            <w:tcBorders>
+              <w:top w:val="single" w:color="CCCCCC" w:sz="1"/>
+              <w:left w:val="single" w:color="CCCCCC" w:sz="1"/>
+              <w:bottom w:val="single" w:color="CCCCCC" w:sz="1"/>
+              <w:right w:val="single" w:color="CCCCCC" w:sz="1"/>
+            </w:tcBorders>
+            <w:shd w:fill="FFFFFF" w:val="clear"/>
+            <w:tcMar>
+              <w:top w:type="dxa" w:w="80"/>
+              <w:left w:type="dxa" w:w="160"/>
+              <w:bottom w:type="dxa" w:w="80"/>
+              <w:right w:type="dxa" w:w="160"/>
+            </w:tcMar>
+          </w:tcPr>
+          <w:p>
+            <w:r>
+              <w:rPr>
+                <w:rFonts w:ascii="Arial" w:cs="Arial" w:eastAsia="Arial" w:hAnsi="Arial"/>
+                <w:sz w:val="20"/>
+                <w:szCs w:val="20"/>
+              </w:rPr>
+              <w:t xml:space="preserve">Next Tab</w:t>
+            </w:r>
+          </w:p>
+        </w:tc>
+        <w:tc>
+          <w:tcPr>
+            <w:tcW w:type="dxa" w:w="4360"/>
+            <w:tcBorders>
+              <w:top w:val="single" w:color="CCCCCC" w:sz="1"/>
+              <w:left w:val="single" w:color="CCCCCC" w:sz="1"/>
+              <w:bottom w:val="single" w:color="CCCCCC" w:sz="1"/>
+              <w:right w:val="single" w:color="CCCCCC" w:sz="1"/>
+            </w:tcBorders>
+            <w:shd w:fill="F0F4FF" w:val="clear"/>
+            <w:tcMar>
+              <w:top w:type="dxa" w:w="80"/>
+              <w:left w:type="dxa" w:w="160"/>
+              <w:bottom w:type="dxa" w:w="80"/>
+              <w:right w:type="dxa" w:w="160"/>
+            </w:tcMar>
+          </w:tcPr>
+          <w:p>
+            <w:r>
+              <w:rPr>
+                <w:rFonts w:ascii="Courier New" w:cs="Courier New" w:eastAsia="Courier New" w:hAnsi="Courier New"/>
+                <w:b/>
+                <w:bCs/>
+                <w:color w:val="1A3A5C"/>
+                <w:sz w:val="20"/>
+                <w:szCs w:val="20"/>
+              </w:rPr>
+              <w:t xml:space="preserve">Ctrl+Tab</w:t>
             </w:r>
           </w:p>
         </w:tc>
@@ -9887,6 +10301,401 @@
       </w:r>
     </w:p>
     <w:p>
+      <w:r>
+        <w:br w:type="page"/>
+      </w:r>
+    </w:p>
+    <w:p>
+      <w:pPr>
+        <w:pStyle w:val="Heading1"/>
+        <w:spacing w:after="120" w:before="400"/>
+      </w:pPr>
+      <w:r>
+        <w:rPr>
+          <w:rFonts w:ascii="Arial" w:cs="Arial" w:eastAsia="Arial" w:hAnsi="Arial"/>
+          <w:b/>
+          <w:bCs/>
+          <w:color w:val="1A3A5C"/>
+          <w:sz w:val="32"/>
+          <w:szCs w:val="32"/>
+        </w:rPr>
+        <w:t xml:space="preserve">22. Multi-File Tabs</w:t>
+      </w:r>
+    </w:p>
+    <w:p>
+      <w:pPr>
+        <w:spacing w:after="80" w:before="80"/>
+      </w:pPr>
+      <w:r>
+        <w:rPr>
+          <w:rFonts w:ascii="Arial" w:cs="Arial" w:eastAsia="Arial" w:hAnsi="Arial"/>
+          <w:sz w:val="22"/>
+          <w:szCs w:val="22"/>
+        </w:rPr>
+        <w:t xml:space="preserve">GHS Markdown Editor v1.1.0 supports multiple open files simultaneously. Each file lives in its own tab in the titlebar, so you can switch between documents instantly without closing and reopening files.</w:t>
+      </w:r>
+    </w:p>
+    <w:p>
+      <w:pPr>
+        <w:pStyle w:val="Heading2"/>
+        <w:spacing w:after="100" w:before="300"/>
+      </w:pPr>
+      <w:r>
+        <w:rPr>
+          <w:rFonts w:ascii="Arial" w:cs="Arial" w:eastAsia="Arial" w:hAnsi="Arial"/>
+          <w:b/>
+          <w:bCs/>
+          <w:color w:val="1A5C8A"/>
+          <w:sz w:val="26"/>
+          <w:szCs w:val="26"/>
+        </w:rPr>
+        <w:t xml:space="preserve">The Tab Strip</w:t>
+      </w:r>
+    </w:p>
+    <w:p>
+      <w:pPr>
+        <w:spacing w:after="80" w:before="80"/>
+      </w:pPr>
+      <w:r>
+        <w:rPr>
+          <w:rFonts w:ascii="Arial" w:cs="Arial" w:eastAsia="Arial" w:hAnsi="Arial"/>
+          <w:sz w:val="22"/>
+          <w:szCs w:val="22"/>
+        </w:rPr>
+        <w:t xml:space="preserve">The tab strip runs across the titlebar between the app name label and the view mode buttons. Each tab shows the filename (or “Untitled” for unsaved documents). A blue dot on a tab means the file has unsaved changes. The active tab has a blue accent underline.</w:t>
+      </w:r>
+    </w:p>
+    <w:p>
+      <w:pPr>
+        <w:pStyle w:val="Heading2"/>
+        <w:spacing w:after="100" w:before="300"/>
+      </w:pPr>
+      <w:r>
+        <w:rPr>
+          <w:rFonts w:ascii="Arial" w:cs="Arial" w:eastAsia="Arial" w:hAnsi="Arial"/>
+          <w:b/>
+          <w:bCs/>
+          <w:color w:val="1A5C8A"/>
+          <w:sz w:val="26"/>
+          <w:szCs w:val="26"/>
+        </w:rPr>
+        <w:t xml:space="preserve">Opening Files in Tabs</w:t>
+      </w:r>
+    </w:p>
+    <w:p>
+      <w:pPr>
+        <w:numPr>
+          <w:ilvl w:val="0"/>
+          <w:numId w:val="1"/>
+        </w:numPr>
+        <w:spacing w:after="60" w:before="60"/>
+      </w:pPr>
+      <w:r>
+        <w:rPr>
+          <w:rFonts w:ascii="Arial" w:cs="Arial" w:eastAsia="Arial" w:hAnsi="Arial"/>
+          <w:sz w:val="22"/>
+          <w:szCs w:val="22"/>
+        </w:rPr>
+        <w:t xml:space="preserve">Press </w:t>
+      </w:r>
+      <w:r>
+        <w:rPr>
+          <w:rFonts w:ascii="Courier New" w:cs="Courier New" w:eastAsia="Courier New" w:hAnsi="Courier New"/>
+          <w:b/>
+          <w:bCs/>
+          <w:sz w:val="22"/>
+          <w:szCs w:val="22"/>
+        </w:rPr>
+        <w:t xml:space="preserve">Ctrl+T</w:t>
+      </w:r>
+      <w:r>
+        <w:rPr>
+          <w:rFonts w:ascii="Arial" w:cs="Arial" w:eastAsia="Arial" w:hAnsi="Arial"/>
+          <w:sz w:val="22"/>
+          <w:szCs w:val="22"/>
+        </w:rPr>
+        <w:t xml:space="preserve"> to open a new blank tab, or click the + button at the right end of the tab strip.</w:t>
+      </w:r>
+    </w:p>
+    <w:p>
+      <w:pPr>
+        <w:numPr>
+          <w:ilvl w:val="0"/>
+          <w:numId w:val="1"/>
+        </w:numPr>
+        <w:spacing w:after="60" w:before="60"/>
+      </w:pPr>
+      <w:r>
+        <w:rPr>
+          <w:rFonts w:ascii="Arial" w:cs="Arial" w:eastAsia="Arial" w:hAnsi="Arial"/>
+          <w:sz w:val="22"/>
+          <w:szCs w:val="22"/>
+        </w:rPr>
+        <w:t xml:space="preserve">Press </w:t>
+      </w:r>
+      <w:r>
+        <w:rPr>
+          <w:rFonts w:ascii="Courier New" w:cs="Courier New" w:eastAsia="Courier New" w:hAnsi="Courier New"/>
+          <w:b/>
+          <w:bCs/>
+          <w:sz w:val="22"/>
+          <w:szCs w:val="22"/>
+        </w:rPr>
+        <w:t xml:space="preserve">Ctrl+O</w:t>
+      </w:r>
+      <w:r>
+        <w:rPr>
+          <w:rFonts w:ascii="Arial" w:cs="Arial" w:eastAsia="Arial" w:hAnsi="Arial"/>
+          <w:sz w:val="22"/>
+          <w:szCs w:val="22"/>
+        </w:rPr>
+        <w:t xml:space="preserve"> to open a file. If the active tab already has content, the file opens in a new tab automatically.</w:t>
+      </w:r>
+    </w:p>
+    <w:p>
+      <w:pPr>
+        <w:numPr>
+          <w:ilvl w:val="0"/>
+          <w:numId w:val="1"/>
+        </w:numPr>
+        <w:spacing w:after="60" w:before="60"/>
+      </w:pPr>
+      <w:r>
+        <w:rPr>
+          <w:rFonts w:ascii="Arial" w:cs="Arial" w:eastAsia="Arial" w:hAnsi="Arial"/>
+          <w:sz w:val="22"/>
+          <w:szCs w:val="22"/>
+        </w:rPr>
+        <w:t xml:space="preserve">Drag a </w:t>
+      </w:r>
+      <w:r>
+        <w:rPr>
+          <w:rFonts w:ascii="Courier New" w:cs="Courier New" w:eastAsia="Courier New" w:hAnsi="Courier New"/>
+          <w:sz w:val="22"/>
+          <w:szCs w:val="22"/>
+        </w:rPr>
+        <w:t xml:space="preserve">.md</w:t>
+      </w:r>
+      <w:r>
+        <w:rPr>
+          <w:rFonts w:ascii="Arial" w:cs="Arial" w:eastAsia="Arial" w:hAnsi="Arial"/>
+          <w:sz w:val="22"/>
+          <w:szCs w:val="22"/>
+        </w:rPr>
+        <w:t xml:space="preserve"> file from Explorer onto the window. If the active tab has content, the file opens in a new tab.</w:t>
+      </w:r>
+    </w:p>
+    <w:p>
+      <w:pPr>
+        <w:numPr>
+          <w:ilvl w:val="0"/>
+          <w:numId w:val="1"/>
+        </w:numPr>
+        <w:spacing w:after="60" w:before="60"/>
+      </w:pPr>
+      <w:r>
+        <w:rPr>
+          <w:rFonts w:ascii="Arial" w:cs="Arial" w:eastAsia="Arial" w:hAnsi="Arial"/>
+          <w:sz w:val="22"/>
+          <w:szCs w:val="22"/>
+        </w:rPr>
+        <w:t xml:space="preserve">Double-click a </w:t>
+      </w:r>
+      <w:r>
+        <w:rPr>
+          <w:rFonts w:ascii="Courier New" w:cs="Courier New" w:eastAsia="Courier New" w:hAnsi="Courier New"/>
+          <w:sz w:val="22"/>
+          <w:szCs w:val="22"/>
+        </w:rPr>
+        <w:t xml:space="preserve">.md</w:t>
+      </w:r>
+      <w:r>
+        <w:rPr>
+          <w:rFonts w:ascii="Arial" w:cs="Arial" w:eastAsia="Arial" w:hAnsi="Arial"/>
+          <w:sz w:val="22"/>
+          <w:szCs w:val="22"/>
+        </w:rPr>
+        <w:t xml:space="preserve"> file in Explorer when the app is already open — the file opens in a new tab in the running window rather than launching a second instance.</w:t>
+      </w:r>
+    </w:p>
+    <w:p>
+      <w:pPr>
+        <w:pStyle w:val="Heading2"/>
+        <w:spacing w:after="100" w:before="300"/>
+      </w:pPr>
+      <w:r>
+        <w:rPr>
+          <w:rFonts w:ascii="Arial" w:cs="Arial" w:eastAsia="Arial" w:hAnsi="Arial"/>
+          <w:b/>
+          <w:bCs/>
+          <w:color w:val="1A5C8A"/>
+          <w:sz w:val="26"/>
+          <w:szCs w:val="26"/>
+        </w:rPr>
+        <w:t xml:space="preserve">Switching and Closing Tabs</w:t>
+      </w:r>
+    </w:p>
+    <w:p>
+      <w:pPr>
+        <w:numPr>
+          <w:ilvl w:val="0"/>
+          <w:numId w:val="1"/>
+        </w:numPr>
+        <w:spacing w:after="60" w:before="60"/>
+      </w:pPr>
+      <w:r>
+        <w:rPr>
+          <w:rFonts w:ascii="Arial" w:cs="Arial" w:eastAsia="Arial" w:hAnsi="Arial"/>
+          <w:sz w:val="22"/>
+          <w:szCs w:val="22"/>
+        </w:rPr>
+        <w:t xml:space="preserve">Click any tab to switch to it. Each tab independently preserves its own editor scroll position, preview scroll position, and caret line.</w:t>
+      </w:r>
+    </w:p>
+    <w:p>
+      <w:pPr>
+        <w:numPr>
+          <w:ilvl w:val="0"/>
+          <w:numId w:val="1"/>
+        </w:numPr>
+        <w:spacing w:after="60" w:before="60"/>
+      </w:pPr>
+      <w:r>
+        <w:rPr>
+          <w:rFonts w:ascii="Arial" w:cs="Arial" w:eastAsia="Arial" w:hAnsi="Arial"/>
+          <w:sz w:val="22"/>
+          <w:szCs w:val="22"/>
+        </w:rPr>
+        <w:t xml:space="preserve">Press </w:t>
+      </w:r>
+      <w:r>
+        <w:rPr>
+          <w:rFonts w:ascii="Courier New" w:cs="Courier New" w:eastAsia="Courier New" w:hAnsi="Courier New"/>
+          <w:b/>
+          <w:bCs/>
+          <w:sz w:val="22"/>
+          <w:szCs w:val="22"/>
+        </w:rPr>
+        <w:t xml:space="preserve">Ctrl+Tab</w:t>
+      </w:r>
+      <w:r>
+        <w:rPr>
+          <w:rFonts w:ascii="Arial" w:cs="Arial" w:eastAsia="Arial" w:hAnsi="Arial"/>
+          <w:sz w:val="22"/>
+          <w:szCs w:val="22"/>
+        </w:rPr>
+        <w:t xml:space="preserve"> to cycle to the next tab.</w:t>
+      </w:r>
+    </w:p>
+    <w:p>
+      <w:pPr>
+        <w:numPr>
+          <w:ilvl w:val="0"/>
+          <w:numId w:val="1"/>
+        </w:numPr>
+        <w:spacing w:after="60" w:before="60"/>
+      </w:pPr>
+      <w:r>
+        <w:rPr>
+          <w:rFonts w:ascii="Arial" w:cs="Arial" w:eastAsia="Arial" w:hAnsi="Arial"/>
+          <w:sz w:val="22"/>
+          <w:szCs w:val="22"/>
+        </w:rPr>
+        <w:t xml:space="preserve">Click ✕ on a tab or press </w:t>
+      </w:r>
+      <w:r>
+        <w:rPr>
+          <w:rFonts w:ascii="Courier New" w:cs="Courier New" w:eastAsia="Courier New" w:hAnsi="Courier New"/>
+          <w:b/>
+          <w:bCs/>
+          <w:sz w:val="22"/>
+          <w:szCs w:val="22"/>
+        </w:rPr>
+        <w:t xml:space="preserve">Ctrl+W</w:t>
+      </w:r>
+      <w:r>
+        <w:rPr>
+          <w:rFonts w:ascii="Arial" w:cs="Arial" w:eastAsia="Arial" w:hAnsi="Arial"/>
+          <w:sz w:val="22"/>
+          <w:szCs w:val="22"/>
+        </w:rPr>
+        <w:t xml:space="preserve"> to close a tab. Middle-click also closes a tab. If the tab has unsaved changes, a Save / Don’t Save / Cancel dialog appears first.</w:t>
+      </w:r>
+    </w:p>
+    <w:p>
+      <w:pPr>
+        <w:pStyle w:val="Heading2"/>
+        <w:spacing w:after="100" w:before="300"/>
+      </w:pPr>
+      <w:r>
+        <w:rPr>
+          <w:rFonts w:ascii="Arial" w:cs="Arial" w:eastAsia="Arial" w:hAnsi="Arial"/>
+          <w:b/>
+          <w:bCs/>
+          <w:color w:val="1A5C8A"/>
+          <w:sz w:val="26"/>
+          <w:szCs w:val="26"/>
+        </w:rPr>
+        <w:t xml:space="preserve">Tab Persistence</w:t>
+      </w:r>
+    </w:p>
+    <w:p>
+      <w:pPr>
+        <w:spacing w:after="80" w:before="80"/>
+      </w:pPr>
+      <w:r>
+        <w:rPr>
+          <w:rFonts w:ascii="Arial" w:cs="Arial" w:eastAsia="Arial" w:hAnsi="Arial"/>
+          <w:sz w:val="22"/>
+          <w:szCs w:val="22"/>
+        </w:rPr>
+        <w:t xml:space="preserve">Your open tabs are saved when you close the app and restored on relaunch — same files, same active tab, same scroll position. Untitled tabs with no content are not restored. Up to 10 tabs are restored per session.</w:t>
+      </w:r>
+    </w:p>
+    <w:p>
+      <w:pPr>
+        <w:spacing w:after="80" w:before="80"/>
+      </w:pPr>
+      <w:r>
+        <w:rPr>
+          <w:rFonts w:ascii="Arial" w:cs="Arial" w:eastAsia="Arial" w:hAnsi="Arial"/>
+          <w:sz w:val="22"/>
+          <w:szCs w:val="22"/>
+        </w:rPr>
+        <w:t xml:space="preserve">Closing the app with any tabs containing unsaved changes will prompt you for each dirty tab before exiting — you can save, discard, or cancel the close for each one individually.</w:t>
+      </w:r>
+    </w:p>
+    <w:p>
+      <w:pPr>
+        <w:pStyle w:val="Heading2"/>
+        <w:spacing w:after="100" w:before="300"/>
+      </w:pPr>
+      <w:r>
+        <w:rPr>
+          <w:rFonts w:ascii="Arial" w:cs="Arial" w:eastAsia="Arial" w:hAnsi="Arial"/>
+          <w:b/>
+          <w:bCs/>
+          <w:color w:val="1A5C8A"/>
+          <w:sz w:val="26"/>
+          <w:szCs w:val="26"/>
+        </w:rPr>
+        <w:t xml:space="preserve">Single Instance</w:t>
+      </w:r>
+    </w:p>
+    <w:p>
+      <w:pPr>
+        <w:spacing w:after="80" w:before="80"/>
+      </w:pPr>
+      <w:r>
+        <w:rPr>
+          <w:rFonts w:ascii="Arial" w:cs="Arial" w:eastAsia="Arial" w:hAnsi="Arial"/>
+          <w:sz w:val="22"/>
+          <w:szCs w:val="22"/>
+        </w:rPr>
+        <w:t xml:space="preserve">Only one instance of GHS Markdown Editor runs at a time on Windows. If you try to launch a second instance — by double-clicking a file in Explorer or running the app again — the running window comes to the front and the file opens in a new tab. No second window opens.</w:t>
+      </w:r>
+    </w:p>
+    <w:p>
       <w:pPr>
         <w:pBdr>
           <w:top w:val="single" w:color="CCCCCC" w:sz="2"/>
@@ -9903,7 +10712,7 @@
           <w:sz w:val="18"/>
           <w:szCs w:val="18"/>
         </w:rPr>
-        <w:t xml:space="preserve">GHS Markdown Editor v1.0.0  ·  github.com/michaeldhead/MarkDown-CrossPlatform</w:t>
+        <w:t xml:space="preserve">GHS Markdown Editor v1.1.0  ·  github.com/michaeldhead/MarkDown-CrossPlatform</w:t>
       </w:r>
     </w:p>
     <w:sectPr>

</xml_diff>